<commit_message>
Deploy permanently to Vercel + serverless entrypoint
- Added api/index.js + vercel.json so the existing Express app runs as a Vercel serverless function with no code rewrite.

- backend/server.js now exports the app and only calls listen() when run directly, so the same module works in dev (npm start) and on Vercel.

- README and report cover updated with the live URL: https://rideflow-tau.vercel.app

- Report PDF and DOCX regenerated to include the live URL on the cover page.
</commit_message>
<xml_diff>
--- a/report/RideFlow_D3_Report.docx
+++ b/report/RideFlow_D3_Report.docx
@@ -150,6 +150,23 @@
       </w:r>
       <w:r>
         <w:t xml:space="preserve">github.com/Vikram-Kumar-Parmar/RideFlow</w:t>
+      </w:r>
+    </w:p>
+    <w:p>
+      <w:pPr>
+        <w:pStyle w:val="BodyText"/>
+      </w:pPr>
+      <w:r>
+        <w:rPr>
+          <w:b/>
+        </w:rPr>
+        <w:t xml:space="preserve">Live URL:</w:t>
+      </w:r>
+      <w:r>
+        <w:t xml:space="preserve"> </w:t>
+      </w:r>
+      <w:r>
+        <w:t xml:space="preserve">rideflow-tau.vercel.app</w:t>
       </w:r>
     </w:p>
     <w:p>

</xml_diff>